<commit_message>
All documents in English; Albanian originals archived
- English literature reviews 24-28 (with English figures), fidelity-reviewed
- TMLE review (24): correct the claim of Section 10.4 (with the drought index
  the design reaches RMSE 0.050 at 2 000 wells, not at 1 000), also in
  experiments/tmle_go/README.md
- experiments/*_go: figure scripts with English labels (paths relative to the
  script; output identical to the figures in the English reviews)
- READMEs point to the English document names
- Albanian originals moved to docs/archive/albanian/

Co-Authored-By: Claude Opus 5.5 <noreply@anthropic.com>
Claude-Session: https://claude.ai/code/session_016Cdcj2FTAQGBVsJUyYJR2M
</commit_message>
<xml_diff>
--- a/docs/literature/Literature_review_TMLE_Continuous_Time_Outcome_Means_Under_Intervention_2020-2026.docx
+++ b/docs/literature/Literature_review_TMLE_Continuous_Time_Outcome_Means_Under_Intervention_2020-2026.docx
@@ -9415,7 +9415,7 @@
             <w:vAlign w:val="top"/>
           </w:tcPr>
           <w:p>
-            <w:hyperlink w:history="1" r:id="rIdxkjhaiy02a1a0uhgcqktt">
+            <w:hyperlink w:history="1" r:id="rIdnzcqeg40qbdtpll1jbk0m">
               <w:r>
                 <w:rPr>
                   <w:color w:val="1D4ED8"/>
@@ -11129,7 +11129,7 @@
             <w:vAlign w:val="top"/>
           </w:tcPr>
           <w:p>
-            <w:hyperlink w:history="1" r:id="rIdbqllw4zujaifht1w8m6so">
+            <w:hyperlink w:history="1" r:id="rIdmnztebeyewcezzi8cjlcn">
               <w:r>
                 <w:rPr>
                   <w:color w:val="1D4ED8"/>
@@ -12553,7 +12553,7 @@
             <w:vAlign w:val="top"/>
           </w:tcPr>
           <w:p>
-            <w:hyperlink w:history="1" r:id="rId1bpfcqgcczdnnkteci40s">
+            <w:hyperlink w:history="1" r:id="rIduwvv0vj_oatqlmbyh8yga">
               <w:r>
                 <w:rPr>
                   <w:color w:val="1D4ED8"/>
@@ -14052,7 +14052,7 @@
             <w:vAlign w:val="top"/>
           </w:tcPr>
           <w:p>
-            <w:hyperlink w:history="1" r:id="rIdeuru8_0nfbyh26gyh6i6u">
+            <w:hyperlink w:history="1" r:id="rIdr6hskz9xnlfpdgyoqdml_">
               <w:r>
                 <w:rPr>
                   <w:color w:val="1D4ED8"/>
@@ -15485,7 +15485,7 @@
             <w:vAlign w:val="top"/>
           </w:tcPr>
           <w:p>
-            <w:hyperlink w:history="1" r:id="rId79mhxcfpisx1oyaaakz6c">
+            <w:hyperlink w:history="1" r:id="rId43emn6s6qf5sgd-wirb86">
               <w:r>
                 <w:rPr>
                   <w:color w:val="1D4ED8"/>
@@ -17436,7 +17436,7 @@
             <w:vAlign w:val="top"/>
           </w:tcPr>
           <w:p>
-            <w:hyperlink w:history="1" r:id="rIdrgo9glx0i2pt6ravlvkij">
+            <w:hyperlink w:history="1" r:id="rIduxyl9x8hbaj_-39lfpbgj">
               <w:r>
                 <w:rPr>
                   <w:color w:val="1D4ED8"/>
@@ -18904,7 +18904,7 @@
             <w:vAlign w:val="top"/>
           </w:tcPr>
           <w:p>
-            <w:hyperlink w:history="1" r:id="rIdmftuin1uc2ecifta-o4ry">
+            <w:hyperlink w:history="1" r:id="rIdtv9d_vdxbfpsotq646_gu">
               <w:r>
                 <w:rPr>
                   <w:color w:val="1D4ED8"/>
@@ -20399,7 +20399,7 @@
             <w:vAlign w:val="top"/>
           </w:tcPr>
           <w:p>
-            <w:hyperlink w:history="1" r:id="rIdkca64-c72nkss8_6hx1lw">
+            <w:hyperlink w:history="1" r:id="rIdhe3ijg3wnttd8c0h4fdtz">
               <w:r>
                 <w:rPr>
                   <w:color w:val="1D4ED8"/>
@@ -22194,7 +22194,7 @@
             <w:vAlign w:val="top"/>
           </w:tcPr>
           <w:p>
-            <w:hyperlink w:history="1" r:id="rIdaxcbf2b6ux_d_u-uw73fk">
+            <w:hyperlink w:history="1" r:id="rIdrw-9chb-ngbnlpovdt_z9">
               <w:r>
                 <w:rPr>
                   <w:color w:val="1D4ED8"/>
@@ -23766,7 +23766,7 @@
             <w:vAlign w:val="top"/>
           </w:tcPr>
           <w:p>
-            <w:hyperlink w:history="1" r:id="rIdf1qftbsnibpe1r7tqumqe">
+            <w:hyperlink w:history="1" r:id="rIdchf9_3x_chqqigbn9ba2c">
               <w:r>
                 <w:rPr>
                   <w:color w:val="1D4ED8"/>
@@ -25428,7 +25428,7 @@
             <w:vAlign w:val="top"/>
           </w:tcPr>
           <w:p>
-            <w:hyperlink w:history="1" r:id="rIdwugmpp0dn8nora8ndwm0k">
+            <w:hyperlink w:history="1" r:id="rIdahyhdw33ncun6hqfshzlx">
               <w:r>
                 <w:rPr>
                   <w:color w:val="1D4ED8"/>
@@ -27107,7 +27107,7 @@
             <w:vAlign w:val="top"/>
           </w:tcPr>
           <w:p>
-            <w:hyperlink w:history="1" r:id="rIdhldx5lnzjhz8usy4vyjsu">
+            <w:hyperlink w:history="1" r:id="rId1jcl8vr4bh4-a-fjdv8x_">
               <w:r>
                 <w:rPr>
                   <w:color w:val="1D4ED8"/>
@@ -28081,7 +28081,7 @@
             <w:vAlign w:val="top"/>
           </w:tcPr>
           <w:p>
-            <w:hyperlink w:history="1" r:id="rIdld-ti9-7uw9hn8kk24mor">
+            <w:hyperlink w:history="1" r:id="rIdqinklicpwufduwm0ylpnr">
               <w:r>
                 <w:rPr>
                   <w:color w:val="1D4ED8"/>
@@ -30142,7 +30142,7 @@
             <w:vAlign w:val="top"/>
           </w:tcPr>
           <w:p>
-            <w:hyperlink w:history="1" r:id="rIdvyezxsu2l6yr6uqugyrmf">
+            <w:hyperlink w:history="1" r:id="rIdla0xa_x34fxybmki0jpoo">
               <w:r>
                 <w:rPr>
                   <w:color w:val="1D4ED8"/>
@@ -31931,7 +31931,7 @@
             <w:vAlign w:val="top"/>
           </w:tcPr>
           <w:p>
-            <w:hyperlink w:history="1" r:id="rIdzhbycyauzeklkuepjgbyh">
+            <w:hyperlink w:history="1" r:id="rIdhhbscgpm6x0rh_enjqtzu">
               <w:r>
                 <w:rPr>
                   <w:color w:val="1D4ED8"/>
@@ -33274,7 +33274,7 @@
             <w:vAlign w:val="top"/>
           </w:tcPr>
           <w:p>
-            <w:hyperlink w:history="1" r:id="rIdbp267bjgw30nzosjwskt4">
+            <w:hyperlink w:history="1" r:id="rIdz3vrgjmc4jxdbglvzgnyy">
               <w:r>
                 <w:rPr>
                   <w:color w:val="1D4ED8"/>
@@ -34917,7 +34917,7 @@
             <w:vAlign w:val="top"/>
           </w:tcPr>
           <w:p>
-            <w:hyperlink w:history="1" r:id="rIdmse-uqmus1r_jk8heeqqe">
+            <w:hyperlink w:history="1" r:id="rIdchxxlflyyacy1zd5fnrql">
               <w:r>
                 <w:rPr>
                   <w:color w:val="1D4ED8"/>
@@ -36327,7 +36327,7 @@
             <w:vAlign w:val="top"/>
           </w:tcPr>
           <w:p>
-            <w:hyperlink w:history="1" r:id="rIdzfsvuwqbhot05ee7ukoac">
+            <w:hyperlink w:history="1" r:id="rIdcvy1dcgsonqfekovya6i0">
               <w:r>
                 <w:rPr>
                   <w:color w:val="1D4ED8"/>
@@ -37633,7 +37633,7 @@
             <w:vAlign w:val="top"/>
           </w:tcPr>
           <w:p>
-            <w:hyperlink w:history="1" r:id="rIdzzn76txve8phncllh_nz5">
+            <w:hyperlink w:history="1" r:id="rIdtk6w0ihafgveni-ted7de">
               <w:r>
                 <w:rPr>
                   <w:color w:val="1D4ED8"/>
@@ -38841,7 +38841,7 @@
             <w:vAlign w:val="top"/>
           </w:tcPr>
           <w:p>
-            <w:hyperlink w:history="1" r:id="rId4nttrv3kswi1xt6bdwnjp">
+            <w:hyperlink w:history="1" r:id="rId5xniq5-r9yjy9ttzyz8bb">
               <w:r>
                 <w:rPr>
                   <w:color w:val="1D4ED8"/>
@@ -41973,7 +41973,7 @@
               </w:rPr>
               <w:t xml:space="preserve">, 25(200), 1–91. </w:t>
             </w:r>
-            <w:hyperlink w:history="1" r:id="rId5gopurlyzhvgpylzglrao">
+            <w:hyperlink w:history="1" r:id="rIdu6glk8w4lsttr8o2fys8t">
               <w:r>
                 <w:rPr>
                   <w:color w:val="1D4ED8"/>
@@ -42070,7 +42070,7 @@
               </w:rPr>
               <w:t xml:space="preserve">, 35(8), 6600–6608. </w:t>
             </w:r>
-            <w:hyperlink w:history="1" r:id="rIdyhbkhdfhp542jzfgommzy">
+            <w:hyperlink w:history="1" r:id="rIdkz3dyuswmdpp2zzgjabtn">
               <w:r>
                 <w:rPr>
                   <w:color w:val="1D4ED8"/>
@@ -42166,7 +42166,7 @@
               </w:rPr>
               <w:t xml:space="preserve">, 30, 4–33. </w:t>
             </w:r>
-            <w:hyperlink w:history="1" r:id="rIdnva683thudhhsollsihrh">
+            <w:hyperlink w:history="1" r:id="rIdawfv8ieqdmbwxtxqpumr3">
               <w:r>
                 <w:rPr>
                   <w:color w:val="1D4ED8"/>
@@ -42263,7 +42263,7 @@
               </w:rPr>
               <w:t xml:space="preserve">, 19(1), 261–289. </w:t>
             </w:r>
-            <w:hyperlink w:history="1" r:id="rIdepkdtkb8gtocn0lz8gqyh">
+            <w:hyperlink w:history="1" r:id="rIda9sbxv4fq8nmpvho03zfj">
               <w:r>
                 <w:rPr>
                   <w:color w:val="1D4ED8"/>
@@ -42359,7 +42359,7 @@
               </w:rPr>
               <w:t xml:space="preserve">, 34, 28548–28559. </w:t>
             </w:r>
-            <w:hyperlink w:history="1" r:id="rIdf3hsmay4wob9d0oozo_gs">
+            <w:hyperlink w:history="1" r:id="rIdgy-qrvjlcytio_dssqaeq">
               <w:r>
                 <w:rPr>
                   <w:color w:val="1D4ED8"/>
@@ -42456,7 +42456,7 @@
               </w:rPr>
               <w:t xml:space="preserve">, PMLR 139, 4074–4084. </w:t>
             </w:r>
-            <w:hyperlink w:history="1" r:id="rIdpkx4lqnpcxnk2dmbyipb_">
+            <w:hyperlink w:history="1" r:id="rIdqbgbimwfgiittpkxn4n8h">
               <w:r>
                 <w:rPr>
                   <w:color w:val="1D4ED8"/>
@@ -42552,7 +42552,7 @@
               </w:rPr>
               <w:t xml:space="preserve">, 35(3), 518–539. </w:t>
             </w:r>
-            <w:hyperlink w:history="1" r:id="rIdl-7bffjxul3skl7szjtln">
+            <w:hyperlink w:history="1" r:id="rIdmqjhw2zyy1etod0v0t9vp">
               <w:r>
                 <w:rPr>
                   <w:color w:val="1D4ED8"/>
@@ -42649,7 +42649,7 @@
               </w:rPr>
               <w:t xml:space="preserve">, 32(3), 509–523. </w:t>
             </w:r>
-            <w:hyperlink w:history="1" r:id="rIdyo_5pojk5idrujtvepwkg">
+            <w:hyperlink w:history="1" r:id="rIdqqwgqaiskxzghemkunt8d">
               <w:r>
                 <w:rPr>
                   <w:color w:val="1D4ED8"/>
@@ -42745,7 +42745,7 @@
               </w:rPr>
               <w:t xml:space="preserve">, PMLR 119, 11194–11203. </w:t>
             </w:r>
-            <w:hyperlink w:history="1" r:id="rIdebntoz1rapdvawr6nv5tx">
+            <w:hyperlink w:history="1" r:id="rIdnhhkyzgmwrpcrl2bqu-bz">
               <w:r>
                 <w:rPr>
                   <w:color w:val="1D4ED8"/>
@@ -42842,7 +42842,7 @@
               </w:rPr>
               <w:t xml:space="preserve">, PMLR 139, 4829–4838. </w:t>
             </w:r>
-            <w:hyperlink w:history="1" r:id="rId8bb0ppmfcmaonrbgsgxld">
+            <w:hyperlink w:history="1" r:id="rId8d1svef5-3sjsvmbcqi-n">
               <w:r>
                 <w:rPr>
                   <w:color w:val="1D4ED8"/>
@@ -47916,7 +47916,7 @@
         <w:t xml:space="preserve">The value of the drought index grows with the field size.</w:t>
       </w:r>
       <w:r>
-        <w:t xml:space="preserve"> With 500 wells, the design without drought has a slightly smaller RMSE (0.090 versus 0.102), because variance dominates; from 1000 wells upward the design with drought wins, and with 1000 wells it reaches the error (0.076) that the design without drought does not reach even with 8 000 wells (0.073).</w:t>
+        <w:t xml:space="preserve"> With 500 wells, the design without drought has a slightly smaller RMSE (0.090 versus 0.102), because variance dominates; from 1000 wells upward the design with drought wins, and with 2 000 wells it reaches an error (0.050) that the design without drought does not reach even with 8 000 wells (0.073).</w:t>
       </w:r>
     </w:p>
     <w:p>
@@ -48619,7 +48619,7 @@
         </w:rPr>
         <w:t xml:space="preserve"> </w:t>
       </w:r>
-      <w:hyperlink w:history="1" r:id="rIdhscfut5p5nm9cr3vuoko2">
+      <w:hyperlink w:history="1" r:id="rIdlpoxvexxgk_apzbyz7yok">
         <w:r>
           <w:rPr>
             <w:color w:val="1D4ED8"/>
@@ -48680,7 +48680,7 @@
         </w:rPr>
         <w:t xml:space="preserve"> </w:t>
       </w:r>
-      <w:hyperlink w:history="1" r:id="rIds3zxxc_p06lt6wf3e-ef7">
+      <w:hyperlink w:history="1" r:id="rIdbvzb9gbf3u9tqkcc8k5oh">
         <w:r>
           <w:rPr>
             <w:color w:val="1D4ED8"/>
@@ -48741,7 +48741,7 @@
         </w:rPr>
         <w:t xml:space="preserve"> </w:t>
       </w:r>
-      <w:hyperlink w:history="1" r:id="rIdmuoc4wnbnjq3olgjhailj">
+      <w:hyperlink w:history="1" r:id="rIdbomi8d3spw78ohz8snkt8">
         <w:r>
           <w:rPr>
             <w:color w:val="1D4ED8"/>
@@ -48802,7 +48802,7 @@
         </w:rPr>
         <w:t xml:space="preserve"> </w:t>
       </w:r>
-      <w:hyperlink w:history="1" r:id="rIdifj_ymucnqvdxzi_vxwin">
+      <w:hyperlink w:history="1" r:id="rIdvcyfwzvvrwik2npwm1hrq">
         <w:r>
           <w:rPr>
             <w:color w:val="1D4ED8"/>
@@ -48863,7 +48863,7 @@
         </w:rPr>
         <w:t xml:space="preserve"> </w:t>
       </w:r>
-      <w:hyperlink w:history="1" r:id="rIdp6qb4jjfau9fo1vsad37c">
+      <w:hyperlink w:history="1" r:id="rId0idasiw9en1c3jlrkedch">
         <w:r>
           <w:rPr>
             <w:color w:val="1D4ED8"/>
@@ -48924,7 +48924,7 @@
         </w:rPr>
         <w:t xml:space="preserve"> </w:t>
       </w:r>
-      <w:hyperlink w:history="1" r:id="rIdhulyej6oprlm4uc3f5qbd">
+      <w:hyperlink w:history="1" r:id="rId-v5uwnaornvauj234jar5">
         <w:r>
           <w:rPr>
             <w:color w:val="1D4ED8"/>
@@ -48985,7 +48985,7 @@
         </w:rPr>
         <w:t xml:space="preserve"> </w:t>
       </w:r>
-      <w:hyperlink w:history="1" r:id="rIdficmo8d_aiyghqyr4_htw">
+      <w:hyperlink w:history="1" r:id="rIdwgi09emzhl5_u_3fhth-f">
         <w:r>
           <w:rPr>
             <w:color w:val="1D4ED8"/>
@@ -49089,7 +49089,7 @@
         </w:rPr>
         <w:t xml:space="preserve"> </w:t>
       </w:r>
-      <w:hyperlink w:history="1" r:id="rIdjieuwkfrlb8dnensyqbpm">
+      <w:hyperlink w:history="1" r:id="rIdqzuxldyutkqlemia0j7wq">
         <w:r>
           <w:rPr>
             <w:color w:val="1D4ED8"/>
@@ -49150,7 +49150,7 @@
         </w:rPr>
         <w:t xml:space="preserve"> </w:t>
       </w:r>
-      <w:hyperlink w:history="1" r:id="rIdgks1l99s44pqzmorcnye_">
+      <w:hyperlink w:history="1" r:id="rId1ceugpcbu7plxvp6rs8sd">
         <w:r>
           <w:rPr>
             <w:color w:val="1D4ED8"/>
@@ -49211,7 +49211,7 @@
         </w:rPr>
         <w:t xml:space="preserve"> </w:t>
       </w:r>
-      <w:hyperlink w:history="1" r:id="rIdhl8tblnzta-walusqw5l6">
+      <w:hyperlink w:history="1" r:id="rIdazjlnnww3-efknr0bzk6o">
         <w:r>
           <w:rPr>
             <w:color w:val="1D4ED8"/>
@@ -49272,7 +49272,7 @@
         </w:rPr>
         <w:t xml:space="preserve"> </w:t>
       </w:r>
-      <w:hyperlink w:history="1" r:id="rIdawl3n5lvez0gct_fjyr4-">
+      <w:hyperlink w:history="1" r:id="rId_fmmcod9knffrsayci8se">
         <w:r>
           <w:rPr>
             <w:color w:val="1D4ED8"/>
@@ -49333,7 +49333,7 @@
         </w:rPr>
         <w:t xml:space="preserve"> </w:t>
       </w:r>
-      <w:hyperlink w:history="1" r:id="rId_gpmzbt_qg0kkougvacll">
+      <w:hyperlink w:history="1" r:id="rIdp02gferu3nzpuqrkafke8">
         <w:r>
           <w:rPr>
             <w:color w:val="1D4ED8"/>
@@ -49394,7 +49394,7 @@
         </w:rPr>
         <w:t xml:space="preserve"> </w:t>
       </w:r>
-      <w:hyperlink w:history="1" r:id="rIditqmdcapez0oyfl_tad3i">
+      <w:hyperlink w:history="1" r:id="rIdyb6ye8bruokewt0ymqz9r">
         <w:r>
           <w:rPr>
             <w:color w:val="1D4ED8"/>
@@ -49455,7 +49455,7 @@
         </w:rPr>
         <w:t xml:space="preserve"> </w:t>
       </w:r>
-      <w:hyperlink w:history="1" r:id="rIdijbro3lwy2vfbbq4fq_xq">
+      <w:hyperlink w:history="1" r:id="rIdug0cbbs67vvlpsc23hhju">
         <w:r>
           <w:rPr>
             <w:color w:val="1D4ED8"/>
@@ -49516,7 +49516,7 @@
         </w:rPr>
         <w:t xml:space="preserve"> </w:t>
       </w:r>
-      <w:hyperlink w:history="1" r:id="rIdfnaiziyeradec3o_pingy">
+      <w:hyperlink w:history="1" r:id="rIds01qe_qfv8ctfp6e26p8q">
         <w:r>
           <w:rPr>
             <w:color w:val="1D4ED8"/>
@@ -49577,7 +49577,7 @@
         </w:rPr>
         <w:t xml:space="preserve"> </w:t>
       </w:r>
-      <w:hyperlink w:history="1" r:id="rIdguhz_j53lonzwvndrf63i">
+      <w:hyperlink w:history="1" r:id="rIdcv7jzryagdlraehmzjtyn">
         <w:r>
           <w:rPr>
             <w:color w:val="1D4ED8"/>
@@ -49638,7 +49638,7 @@
         </w:rPr>
         <w:t xml:space="preserve"> </w:t>
       </w:r>
-      <w:hyperlink w:history="1" r:id="rId0l1hszxv8kl92uqisqzhz">
+      <w:hyperlink w:history="1" r:id="rId3pg0cwasjbtcwr6objhep">
         <w:r>
           <w:rPr>
             <w:color w:val="1D4ED8"/>
@@ -49742,7 +49742,7 @@
         </w:rPr>
         <w:t xml:space="preserve"> </w:t>
       </w:r>
-      <w:hyperlink w:history="1" r:id="rId3ipq6eggljbfm2mlb5hwv">
+      <w:hyperlink w:history="1" r:id="rIdpz5vcqxbormll0xjzgztq">
         <w:r>
           <w:rPr>
             <w:color w:val="1D4ED8"/>
@@ -49814,7 +49814,7 @@
         </w:rPr>
         <w:t xml:space="preserve"> </w:t>
       </w:r>
-      <w:hyperlink w:history="1" r:id="rIduinqhv_kizdm0q-6nxwee">
+      <w:hyperlink w:history="1" r:id="rId09ajelv5bfjqqzmf2vwsa">
         <w:r>
           <w:rPr>
             <w:color w:val="1D4ED8"/>
@@ -49875,7 +49875,7 @@
         </w:rPr>
         <w:t xml:space="preserve"> </w:t>
       </w:r>
-      <w:hyperlink w:history="1" r:id="rId9bicftnjve-uoeh4yu7mq">
+      <w:hyperlink w:history="1" r:id="rIdckpvkhr9bicwfg1iedift">
         <w:r>
           <w:rPr>
             <w:color w:val="1D4ED8"/>
@@ -49936,7 +49936,7 @@
         </w:rPr>
         <w:t xml:space="preserve"> </w:t>
       </w:r>
-      <w:hyperlink w:history="1" r:id="rIdg80m30z0u_46z7mtt5ds6">
+      <w:hyperlink w:history="1" r:id="rIdo7qfhmkz7t7ewsouh7xz9">
         <w:r>
           <w:rPr>
             <w:color w:val="1D4ED8"/>
@@ -49997,7 +49997,7 @@
         </w:rPr>
         <w:t xml:space="preserve"> </w:t>
       </w:r>
-      <w:hyperlink w:history="1" r:id="rIdiwe2w7ipliklbgc5ajomf">
+      <w:hyperlink w:history="1" r:id="rIdqwtncvgwgekldmewqm40f">
         <w:r>
           <w:rPr>
             <w:color w:val="1D4ED8"/>
@@ -50058,7 +50058,7 @@
         </w:rPr>
         <w:t xml:space="preserve"> </w:t>
       </w:r>
-      <w:hyperlink w:history="1" r:id="rId9jde5ts3fkka1xp5swlax">
+      <w:hyperlink w:history="1" r:id="rId-0dswd7z093rwlrvyi0n2">
         <w:r>
           <w:rPr>
             <w:color w:val="1D4ED8"/>
@@ -50119,7 +50119,7 @@
         </w:rPr>
         <w:t xml:space="preserve"> </w:t>
       </w:r>
-      <w:hyperlink w:history="1" r:id="rIdmp2jdwf1v8gnzjbgem_-o">
+      <w:hyperlink w:history="1" r:id="rIdv4iwwvnu894tphkk15n3u">
         <w:r>
           <w:rPr>
             <w:color w:val="1D4ED8"/>
@@ -50180,7 +50180,7 @@
         </w:rPr>
         <w:t xml:space="preserve"> </w:t>
       </w:r>
-      <w:hyperlink w:history="1" r:id="rIdlgozi8dhbm04rws7n745z">
+      <w:hyperlink w:history="1" r:id="rIdyuu4subq3cumknqdxyulv">
         <w:r>
           <w:rPr>
             <w:color w:val="1D4ED8"/>
@@ -50241,7 +50241,7 @@
         </w:rPr>
         <w:t xml:space="preserve"> </w:t>
       </w:r>
-      <w:hyperlink w:history="1" r:id="rIdsgk1kvuhyubsnotjfohls">
+      <w:hyperlink w:history="1" r:id="rIdfrrdz5ob4yzkxvt9arsrn">
         <w:r>
           <w:rPr>
             <w:color w:val="1D4ED8"/>
@@ -50302,7 +50302,7 @@
         </w:rPr>
         <w:t xml:space="preserve"> </w:t>
       </w:r>
-      <w:hyperlink w:history="1" r:id="rIdwpzyijccwohooaitpn0sa">
+      <w:hyperlink w:history="1" r:id="rIdbajn8bkjhwpckda6s6m_e">
         <w:r>
           <w:rPr>
             <w:color w:val="1D4ED8"/>
@@ -50363,7 +50363,7 @@
         </w:rPr>
         <w:t xml:space="preserve"> </w:t>
       </w:r>
-      <w:hyperlink w:history="1" r:id="rId3he7nopwuqwabrbc1es1e">
+      <w:hyperlink w:history="1" r:id="rIdidv5xrtaw8_yoc37h4wtd">
         <w:r>
           <w:rPr>
             <w:color w:val="1D4ED8"/>
@@ -50424,7 +50424,7 @@
         </w:rPr>
         <w:t xml:space="preserve"> </w:t>
       </w:r>
-      <w:hyperlink w:history="1" r:id="rIdd1qsuapmj5loylfjzvvro">
+      <w:hyperlink w:history="1" r:id="rId4gzacfcy0_r_cyfulysah">
         <w:r>
           <w:rPr>
             <w:color w:val="1D4ED8"/>
@@ -50485,7 +50485,7 @@
         </w:rPr>
         <w:t xml:space="preserve"> </w:t>
       </w:r>
-      <w:hyperlink w:history="1" r:id="rIdwdfrnmzni6ept3xbth2gr">
+      <w:hyperlink w:history="1" r:id="rIdvc-dk4tvodkwiaygsqh4u">
         <w:r>
           <w:rPr>
             <w:color w:val="1D4ED8"/>
@@ -50546,7 +50546,7 @@
         </w:rPr>
         <w:t xml:space="preserve"> </w:t>
       </w:r>
-      <w:hyperlink w:history="1" r:id="rIdkxbr-hwvr9hzbrjwzut2h">
+      <w:hyperlink w:history="1" r:id="rIdo2euauyxacjwyh_rfyx1n">
         <w:r>
           <w:rPr>
             <w:color w:val="1D4ED8"/>
@@ -50607,7 +50607,7 @@
         </w:rPr>
         <w:t xml:space="preserve"> </w:t>
       </w:r>
-      <w:hyperlink w:history="1" r:id="rIdc4ileeohjpdyvxm7haz27">
+      <w:hyperlink w:history="1" r:id="rIdtp0n28tnb7o57gqzjbkvt">
         <w:r>
           <w:rPr>
             <w:color w:val="1D4ED8"/>
@@ -50668,7 +50668,7 @@
         </w:rPr>
         <w:t xml:space="preserve"> </w:t>
       </w:r>
-      <w:hyperlink w:history="1" r:id="rIdib0ybqjqpfwn7nnbdmfj-">
+      <w:hyperlink w:history="1" r:id="rIdy-g-mi5oe3xpgipq2vckh">
         <w:r>
           <w:rPr>
             <w:color w:val="1D4ED8"/>
@@ -50729,7 +50729,7 @@
         </w:rPr>
         <w:t xml:space="preserve"> </w:t>
       </w:r>
-      <w:hyperlink w:history="1" r:id="rIdy7aowkf0icagscmys_bhk">
+      <w:hyperlink w:history="1" r:id="rIddtcrtmm20lcuvdk24_s85">
         <w:r>
           <w:rPr>
             <w:color w:val="1D4ED8"/>
@@ -50790,7 +50790,7 @@
         </w:rPr>
         <w:t xml:space="preserve"> </w:t>
       </w:r>
-      <w:hyperlink w:history="1" r:id="rId5we-wmnkga-xpnx__spdm">
+      <w:hyperlink w:history="1" r:id="rId9b2fgs7yywopjdglwgfia">
         <w:r>
           <w:rPr>
             <w:color w:val="1D4ED8"/>
@@ -50851,7 +50851,7 @@
         </w:rPr>
         <w:t xml:space="preserve"> </w:t>
       </w:r>
-      <w:hyperlink w:history="1" r:id="rIdygxdesrmaq3tz3wwhoqto">
+      <w:hyperlink w:history="1" r:id="rIdbkwgmqhvtktncuk0v58lh">
         <w:r>
           <w:rPr>
             <w:color w:val="1D4ED8"/>
@@ -50912,7 +50912,7 @@
         </w:rPr>
         <w:t xml:space="preserve"> </w:t>
       </w:r>
-      <w:hyperlink w:history="1" r:id="rIdw487xrru83tz4dn9unkaq">
+      <w:hyperlink w:history="1" r:id="rId83q7dx4aexbt9av4r97hw">
         <w:r>
           <w:rPr>
             <w:color w:val="1D4ED8"/>
@@ -50973,7 +50973,7 @@
         </w:rPr>
         <w:t xml:space="preserve"> </w:t>
       </w:r>
-      <w:hyperlink w:history="1" r:id="rIdnywuwtcwa3usem-ud4m10">
+      <w:hyperlink w:history="1" r:id="rIdfly0h7_rteehohimhvjdr">
         <w:r>
           <w:rPr>
             <w:color w:val="1D4ED8"/>

</xml_diff>